<commit_message>
[docs](main): 파티 챕터 기획
</commit_message>
<xml_diff>
--- a/기획서/기획서.docx
+++ b/기획서/기획서.docx
@@ -275,7 +275,6 @@
           <w:szCs w:val="22"/>
         </w:rPr>
       </w:pPr>
-      <w:proofErr w:type="gramStart"/>
       <w:r>
         <w:rPr>
           <w:rFonts w:hint="eastAsia"/>
@@ -290,9 +289,36 @@
           <w:sz w:val="20"/>
           <w:szCs w:val="22"/>
         </w:rPr>
-        <w:t xml:space="preserve"> :</w:t>
-      </w:r>
-      <w:proofErr w:type="gramEnd"/>
+        <w:t xml:space="preserve"> : </w:t>
+      </w:r>
+      <w:r>
+        <w:rPr>
+          <w:sz w:val="20"/>
+          <w:szCs w:val="22"/>
+        </w:rPr>
+        <w:t>Windows 10 x64 이상</w:t>
+      </w:r>
+    </w:p>
+    <w:p>
+      <w:pPr>
+        <w:pStyle w:val="a6"/>
+        <w:numPr>
+          <w:ilvl w:val="2"/>
+          <w:numId w:val="5"/>
+        </w:numPr>
+        <w:rPr>
+          <w:sz w:val="20"/>
+          <w:szCs w:val="22"/>
+        </w:rPr>
+      </w:pPr>
+      <w:r>
+        <w:rPr>
+          <w:rFonts w:hint="eastAsia"/>
+          <w:sz w:val="20"/>
+          <w:szCs w:val="22"/>
+        </w:rPr>
+        <w:t>메모리</w:t>
+      </w:r>
       <w:r>
         <w:rPr>
           <w:rFonts w:hint="eastAsia"/>
@@ -306,7 +332,7 @@
           <w:sz w:val="20"/>
           <w:szCs w:val="22"/>
         </w:rPr>
-        <w:t>Windows 10 x64 이상</w:t>
+        <w:t>: 8GB RAM 이상</w:t>
       </w:r>
     </w:p>
     <w:p>
@@ -321,14 +347,13 @@
           <w:szCs w:val="22"/>
         </w:rPr>
       </w:pPr>
-      <w:proofErr w:type="gramStart"/>
-      <w:r>
-        <w:rPr>
-          <w:rFonts w:hint="eastAsia"/>
-          <w:sz w:val="20"/>
-          <w:szCs w:val="22"/>
-        </w:rPr>
-        <w:t>메모리</w:t>
+      <w:r>
+        <w:rPr>
+          <w:rFonts w:hint="eastAsia"/>
+          <w:sz w:val="20"/>
+          <w:szCs w:val="22"/>
+        </w:rPr>
+        <w:t>그래픽카드</w:t>
       </w:r>
       <w:r>
         <w:rPr>
@@ -343,15 +368,7 @@
           <w:sz w:val="20"/>
           <w:szCs w:val="22"/>
         </w:rPr>
-        <w:t>:</w:t>
-      </w:r>
-      <w:proofErr w:type="gramEnd"/>
-      <w:r>
-        <w:rPr>
-          <w:sz w:val="20"/>
-          <w:szCs w:val="22"/>
-        </w:rPr>
-        <w:t xml:space="preserve"> 8GB RAM 이상</w:t>
+        <w:t>: GTX 1060 이상</w:t>
       </w:r>
     </w:p>
     <w:p>
@@ -366,14 +383,12 @@
           <w:szCs w:val="22"/>
         </w:rPr>
       </w:pPr>
-      <w:proofErr w:type="gramStart"/>
-      <w:r>
-        <w:rPr>
-          <w:rFonts w:hint="eastAsia"/>
-          <w:sz w:val="20"/>
-          <w:szCs w:val="22"/>
-        </w:rPr>
-        <w:t>그래픽카드</w:t>
+      <w:r>
+        <w:rPr>
+          <w:sz w:val="20"/>
+          <w:szCs w:val="22"/>
+        </w:rPr>
+        <w:t>CPU</w:t>
       </w:r>
       <w:r>
         <w:rPr>
@@ -388,59 +403,7 @@
           <w:sz w:val="20"/>
           <w:szCs w:val="22"/>
         </w:rPr>
-        <w:t>:</w:t>
-      </w:r>
-      <w:proofErr w:type="gramEnd"/>
-      <w:r>
-        <w:rPr>
-          <w:sz w:val="20"/>
-          <w:szCs w:val="22"/>
-        </w:rPr>
-        <w:t xml:space="preserve"> GTX 1060 이상</w:t>
-      </w:r>
-    </w:p>
-    <w:p>
-      <w:pPr>
-        <w:pStyle w:val="a6"/>
-        <w:numPr>
-          <w:ilvl w:val="2"/>
-          <w:numId w:val="5"/>
-        </w:numPr>
-        <w:rPr>
-          <w:sz w:val="20"/>
-          <w:szCs w:val="22"/>
-        </w:rPr>
-      </w:pPr>
-      <w:proofErr w:type="gramStart"/>
-      <w:r>
-        <w:rPr>
-          <w:sz w:val="20"/>
-          <w:szCs w:val="22"/>
-        </w:rPr>
-        <w:t>CPU</w:t>
-      </w:r>
-      <w:r>
-        <w:rPr>
-          <w:rFonts w:hint="eastAsia"/>
-          <w:sz w:val="20"/>
-          <w:szCs w:val="22"/>
-        </w:rPr>
-        <w:t xml:space="preserve"> </w:t>
-      </w:r>
-      <w:r>
-        <w:rPr>
-          <w:sz w:val="20"/>
-          <w:szCs w:val="22"/>
-        </w:rPr>
-        <w:t>:</w:t>
-      </w:r>
-      <w:proofErr w:type="gramEnd"/>
-      <w:r>
-        <w:rPr>
-          <w:sz w:val="20"/>
-          <w:szCs w:val="22"/>
-        </w:rPr>
-        <w:t xml:space="preserve"> Ryzen 5 3600 이상</w:t>
+        <w:t>: Ryzen 5 3600 이상</w:t>
       </w:r>
     </w:p>
     <w:p>
@@ -455,7 +418,6 @@
           <w:szCs w:val="14"/>
         </w:rPr>
       </w:pPr>
-      <w:proofErr w:type="gramStart"/>
       <w:r>
         <w:rPr>
           <w:rFonts w:hint="eastAsia"/>
@@ -477,15 +439,7 @@
           <w:sz w:val="20"/>
           <w:szCs w:val="22"/>
         </w:rPr>
-        <w:t>:</w:t>
-      </w:r>
-      <w:proofErr w:type="gramEnd"/>
-      <w:r>
-        <w:rPr>
-          <w:sz w:val="20"/>
-          <w:szCs w:val="22"/>
-        </w:rPr>
-        <w:t xml:space="preserve"> 1920x1080 해상도</w:t>
+        <w:t>: 1920x1080 해상도</w:t>
       </w:r>
       <w:r>
         <w:rPr>
@@ -645,17 +599,8 @@
           <w:sz w:val="20"/>
           <w:szCs w:val="22"/>
         </w:rPr>
-        <w:t xml:space="preserve"> 기억들이 돌아오고 새롭게 빛날 수 있을 </w:t>
-      </w:r>
-      <w:proofErr w:type="gramStart"/>
-      <w:r>
-        <w:rPr>
-          <w:sz w:val="20"/>
-          <w:szCs w:val="22"/>
-        </w:rPr>
-        <w:t>것인가.</w:t>
-      </w:r>
-      <w:proofErr w:type="gramEnd"/>
+        <w:t xml:space="preserve"> 기억들이 돌아오고 새롭게 빛날 수 있을 것인가.</w:t>
+      </w:r>
     </w:p>
     <w:p>
       <w:pPr>
@@ -3750,8 +3695,8 @@
         <w:jc w:val="center"/>
         <w:rPr>
           <w:rFonts w:hint="eastAsia"/>
-          <w:sz w:val="20"/>
-          <w:szCs w:val="22"/>
+          <w:sz w:val="12"/>
+          <w:szCs w:val="14"/>
         </w:rPr>
       </w:pPr>
       <w:r>
@@ -3803,6 +3748,13 @@
           </wp:inline>
         </w:drawing>
       </w:r>
+      <w:r>
+        <w:rPr>
+          <w:sz w:val="20"/>
+          <w:szCs w:val="22"/>
+        </w:rPr>
+        <w:br/>
+      </w:r>
     </w:p>
     <w:tbl>
       <w:tblPr>
@@ -7234,10 +7186,63 @@
     </w:tbl>
     <w:p>
       <w:pPr>
-        <w:rPr>
-          <w:rFonts w:hint="eastAsia"/>
-        </w:rPr>
-      </w:pPr>
+        <w:jc w:val="center"/>
+        <w:rPr>
+          <w:rFonts w:hint="eastAsia"/>
+          <w:sz w:val="18"/>
+          <w:szCs w:val="20"/>
+        </w:rPr>
+      </w:pPr>
+      <w:r>
+        <w:rPr>
+          <w:rFonts w:hint="eastAsia"/>
+          <w:sz w:val="18"/>
+          <w:szCs w:val="20"/>
+        </w:rPr>
+        <w:t>각 레벨 진입에 필요한</w:t>
+      </w:r>
+      <w:r>
+        <w:rPr>
+          <w:rFonts w:hint="eastAsia"/>
+          <w:sz w:val="18"/>
+          <w:szCs w:val="20"/>
+        </w:rPr>
+        <w:t xml:space="preserve"> </w:t>
+      </w:r>
+      <w:r>
+        <w:rPr>
+          <w:rFonts w:hint="eastAsia"/>
+          <w:sz w:val="18"/>
+          <w:szCs w:val="20"/>
+        </w:rPr>
+        <w:t>경험치</w:t>
+      </w:r>
+      <w:r>
+        <w:rPr>
+          <w:rFonts w:hint="eastAsia"/>
+          <w:sz w:val="18"/>
+          <w:szCs w:val="20"/>
+        </w:rPr>
+        <w:t xml:space="preserve"> (</w:t>
+      </w:r>
+      <w:proofErr w:type="spellStart"/>
+      <w:r>
+        <w:rPr>
+          <w:rFonts w:hint="eastAsia"/>
+          <w:sz w:val="18"/>
+          <w:szCs w:val="20"/>
+        </w:rPr>
+        <w:t>레벨업</w:t>
+      </w:r>
+      <w:proofErr w:type="spellEnd"/>
+      <w:r>
+        <w:rPr>
+          <w:rFonts w:hint="eastAsia"/>
+          <w:sz w:val="18"/>
+          <w:szCs w:val="20"/>
+        </w:rPr>
+        <w:t xml:space="preserve"> 시 경험치는 0으로 리셋)</w:t>
+      </w:r>
     </w:p>
     <w:p>
       <w:pPr>
@@ -7436,25 +7441,7 @@
           <w:sz w:val="20"/>
           <w:szCs w:val="22"/>
         </w:rPr>
-        <w:t xml:space="preserve">초기 무기 숙련도 </w:t>
-      </w:r>
-      <w:proofErr w:type="gramStart"/>
-      <w:r>
-        <w:rPr>
-          <w:rFonts w:hint="eastAsia"/>
-          <w:sz w:val="20"/>
-          <w:szCs w:val="22"/>
-        </w:rPr>
-        <w:t>0 /</w:t>
-      </w:r>
-      <w:proofErr w:type="gramEnd"/>
-      <w:r>
-        <w:rPr>
-          <w:rFonts w:hint="eastAsia"/>
-          <w:sz w:val="20"/>
-          <w:szCs w:val="22"/>
-        </w:rPr>
-        <w:t xml:space="preserve"> 최종 무기 숙련도 예상치 1000</w:t>
+        <w:t>초기 무기 숙련도 0 / 최종 무기 숙련도 예상치 1000</w:t>
       </w:r>
       <w:r>
         <w:rPr>
@@ -8266,25 +8253,7 @@
           <w:sz w:val="20"/>
           <w:szCs w:val="22"/>
         </w:rPr>
-        <w:t xml:space="preserve">초기 무기 경험치 </w:t>
-      </w:r>
-      <w:proofErr w:type="gramStart"/>
-      <w:r>
-        <w:rPr>
-          <w:rFonts w:hint="eastAsia"/>
-          <w:sz w:val="20"/>
-          <w:szCs w:val="22"/>
-        </w:rPr>
-        <w:t>0 /</w:t>
-      </w:r>
-      <w:proofErr w:type="gramEnd"/>
-      <w:r>
-        <w:rPr>
-          <w:rFonts w:hint="eastAsia"/>
-          <w:sz w:val="20"/>
-          <w:szCs w:val="22"/>
-        </w:rPr>
-        <w:t xml:space="preserve"> 최대 무기 경험치 300</w:t>
+        <w:t>초기 무기 경험치 0 / 최대 무기 경험치 300</w:t>
       </w:r>
     </w:p>
     <w:p>
@@ -9109,48 +9078,1247 @@
       </w:r>
     </w:p>
     <w:p>
+      <w:pPr>
+        <w:pStyle w:val="a6"/>
+        <w:numPr>
+          <w:ilvl w:val="0"/>
+          <w:numId w:val="5"/>
+        </w:numPr>
+        <w:rPr>
+          <w:b/>
+          <w:bCs/>
+        </w:rPr>
+      </w:pPr>
       <w:r>
         <w:rPr>
           <w:rFonts w:hint="eastAsia"/>
         </w:rPr>
         <w:lastRenderedPageBreak/>
+        <w:t xml:space="preserve"> </w:t>
+      </w:r>
+      <w:r>
+        <w:rPr>
+          <w:rFonts w:hint="eastAsia"/>
+          <w:b/>
+          <w:bCs/>
+          <w:sz w:val="32"/>
+          <w:szCs w:val="36"/>
+        </w:rPr>
         <w:t>파티</w:t>
       </w:r>
+    </w:p>
+    <w:p>
+      <w:pPr>
+        <w:pStyle w:val="a6"/>
+        <w:ind w:left="0"/>
+        <w:rPr>
+          <w:rFonts w:hint="eastAsia"/>
+          <w:b/>
+          <w:bCs/>
+          <w:sz w:val="12"/>
+          <w:szCs w:val="14"/>
+        </w:rPr>
+      </w:pPr>
+    </w:p>
+    <w:p>
+      <w:pPr>
+        <w:pStyle w:val="a6"/>
+        <w:numPr>
+          <w:ilvl w:val="1"/>
+          <w:numId w:val="5"/>
+        </w:numPr>
+        <w:rPr>
+          <w:sz w:val="24"/>
+          <w:szCs w:val="28"/>
+        </w:rPr>
+      </w:pPr>
+      <w:r>
+        <w:rPr>
+          <w:rFonts w:hint="eastAsia"/>
+          <w:sz w:val="24"/>
+          <w:szCs w:val="28"/>
+        </w:rPr>
+        <w:t>파티</w:t>
+      </w:r>
+      <w:r>
+        <w:rPr>
+          <w:sz w:val="24"/>
+          <w:szCs w:val="28"/>
+        </w:rPr>
+        <w:t xml:space="preserve"> </w:t>
+      </w:r>
+      <w:r>
+        <w:rPr>
+          <w:rFonts w:hint="eastAsia"/>
+          <w:sz w:val="24"/>
+          <w:szCs w:val="28"/>
+        </w:rPr>
+        <w:t xml:space="preserve">플레이 </w:t>
+      </w:r>
+      <w:r>
+        <w:rPr>
+          <w:sz w:val="24"/>
+          <w:szCs w:val="28"/>
+        </w:rPr>
+        <w:t>컨셉</w:t>
+      </w:r>
+    </w:p>
+    <w:p>
+      <w:pPr>
+        <w:pStyle w:val="a6"/>
+        <w:numPr>
+          <w:ilvl w:val="2"/>
+          <w:numId w:val="5"/>
+        </w:numPr>
+        <w:rPr>
+          <w:sz w:val="20"/>
+          <w:szCs w:val="22"/>
+        </w:rPr>
+      </w:pPr>
+      <w:r>
+        <w:rPr>
+          <w:rFonts w:hint="eastAsia"/>
+          <w:sz w:val="20"/>
+          <w:szCs w:val="22"/>
+        </w:rPr>
+        <w:t>고정된 역할은 없다.</w:t>
+      </w:r>
+    </w:p>
+    <w:p>
+      <w:pPr>
+        <w:pStyle w:val="a6"/>
+        <w:numPr>
+          <w:ilvl w:val="3"/>
+          <w:numId w:val="5"/>
+        </w:numPr>
+        <w:rPr>
+          <w:sz w:val="20"/>
+          <w:szCs w:val="22"/>
+        </w:rPr>
+      </w:pPr>
+      <w:r>
+        <w:rPr>
+          <w:rFonts w:hint="eastAsia"/>
+          <w:sz w:val="20"/>
+          <w:szCs w:val="22"/>
+        </w:rPr>
+        <w:t>체력 특화 플레이어여도 모든 데미지를 계속 받고 있을 순 없다.</w:t>
+      </w:r>
+    </w:p>
+    <w:p>
+      <w:pPr>
+        <w:pStyle w:val="a6"/>
+        <w:numPr>
+          <w:ilvl w:val="3"/>
+          <w:numId w:val="5"/>
+        </w:numPr>
+        <w:rPr>
+          <w:sz w:val="20"/>
+          <w:szCs w:val="22"/>
+        </w:rPr>
+      </w:pPr>
+      <w:r>
+        <w:rPr>
+          <w:rFonts w:hint="eastAsia"/>
+          <w:sz w:val="20"/>
+          <w:szCs w:val="22"/>
+        </w:rPr>
+        <w:t xml:space="preserve">역할 </w:t>
+      </w:r>
+      <w:proofErr w:type="spellStart"/>
+      <w:r>
+        <w:rPr>
+          <w:rFonts w:hint="eastAsia"/>
+          <w:sz w:val="20"/>
+          <w:szCs w:val="22"/>
+        </w:rPr>
+        <w:t>교대식</w:t>
+      </w:r>
+      <w:proofErr w:type="spellEnd"/>
+      <w:r>
+        <w:rPr>
+          <w:rFonts w:hint="eastAsia"/>
+          <w:sz w:val="20"/>
+          <w:szCs w:val="22"/>
+        </w:rPr>
+        <w:t xml:space="preserve"> 플레이가 요구된다.</w:t>
+      </w:r>
+    </w:p>
+    <w:p>
+      <w:pPr>
+        <w:pStyle w:val="a6"/>
+        <w:numPr>
+          <w:ilvl w:val="4"/>
+          <w:numId w:val="5"/>
+        </w:numPr>
+        <w:rPr>
+          <w:sz w:val="20"/>
+          <w:szCs w:val="22"/>
+        </w:rPr>
+      </w:pPr>
+      <w:r>
+        <w:rPr>
+          <w:rFonts w:hint="eastAsia"/>
+          <w:sz w:val="20"/>
+          <w:szCs w:val="22"/>
+        </w:rPr>
+        <w:t>각자 특화된 역할을 수행할 때 더 강한 전투력을 갖는다.</w:t>
+      </w:r>
+    </w:p>
+    <w:p>
+      <w:pPr>
+        <w:pStyle w:val="a6"/>
+        <w:numPr>
+          <w:ilvl w:val="4"/>
+          <w:numId w:val="5"/>
+        </w:numPr>
+        <w:rPr>
+          <w:sz w:val="20"/>
+          <w:szCs w:val="22"/>
+        </w:rPr>
+      </w:pPr>
+      <w:r>
+        <w:rPr>
+          <w:rFonts w:hint="eastAsia"/>
+          <w:sz w:val="20"/>
+          <w:szCs w:val="22"/>
+        </w:rPr>
+        <w:t>각자 특화된 역할을 오래 수행할수록 유리하다.</w:t>
+      </w:r>
+    </w:p>
+    <w:p>
+      <w:pPr>
+        <w:pStyle w:val="a6"/>
+        <w:numPr>
+          <w:ilvl w:val="2"/>
+          <w:numId w:val="5"/>
+        </w:numPr>
+        <w:rPr>
+          <w:sz w:val="20"/>
+          <w:szCs w:val="22"/>
+        </w:rPr>
+      </w:pPr>
+      <w:r>
+        <w:rPr>
+          <w:rFonts w:hint="eastAsia"/>
+          <w:sz w:val="20"/>
+          <w:szCs w:val="22"/>
+        </w:rPr>
+        <w:t>적의 빈틈을 만든다.</w:t>
+      </w:r>
+    </w:p>
+    <w:p>
+      <w:pPr>
+        <w:pStyle w:val="a6"/>
+        <w:numPr>
+          <w:ilvl w:val="3"/>
+          <w:numId w:val="5"/>
+        </w:numPr>
+        <w:rPr>
+          <w:sz w:val="20"/>
+          <w:szCs w:val="22"/>
+        </w:rPr>
+      </w:pPr>
+      <w:r>
+        <w:rPr>
+          <w:rFonts w:hint="eastAsia"/>
+          <w:sz w:val="20"/>
+          <w:szCs w:val="22"/>
+        </w:rPr>
+        <w:t>적을 유인하는 플레이가 가능하다.</w:t>
+      </w:r>
+    </w:p>
+    <w:p>
+      <w:pPr>
+        <w:pStyle w:val="a6"/>
+        <w:numPr>
+          <w:ilvl w:val="3"/>
+          <w:numId w:val="5"/>
+        </w:numPr>
+        <w:rPr>
+          <w:sz w:val="20"/>
+          <w:szCs w:val="22"/>
+        </w:rPr>
+      </w:pPr>
+      <w:r>
+        <w:rPr>
+          <w:rFonts w:hint="eastAsia"/>
+          <w:sz w:val="20"/>
+          <w:szCs w:val="22"/>
+        </w:rPr>
+        <w:t>적의 진형을 붕괴시키는 플레이가 가능하다.</w:t>
+      </w:r>
+    </w:p>
+    <w:p>
+      <w:pPr>
+        <w:pStyle w:val="a6"/>
+        <w:numPr>
+          <w:ilvl w:val="3"/>
+          <w:numId w:val="5"/>
+        </w:numPr>
+        <w:rPr>
+          <w:sz w:val="20"/>
+          <w:szCs w:val="22"/>
+        </w:rPr>
+      </w:pPr>
+      <w:proofErr w:type="spellStart"/>
+      <w:r>
+        <w:rPr>
+          <w:rFonts w:hint="eastAsia"/>
+          <w:sz w:val="20"/>
+          <w:szCs w:val="22"/>
+        </w:rPr>
+        <w:t>탱킹이나</w:t>
+      </w:r>
+      <w:proofErr w:type="spellEnd"/>
+      <w:r>
+        <w:rPr>
+          <w:rFonts w:hint="eastAsia"/>
+          <w:sz w:val="20"/>
+          <w:szCs w:val="22"/>
+        </w:rPr>
+        <w:t xml:space="preserve"> 도망으로 </w:t>
+      </w:r>
+      <w:r>
+        <w:rPr>
+          <w:rFonts w:hint="eastAsia"/>
+          <w:sz w:val="20"/>
+          <w:szCs w:val="22"/>
+        </w:rPr>
+        <w:t>시간을 버는 플레이가 가능하다.</w:t>
+      </w:r>
+    </w:p>
+    <w:p>
+      <w:pPr>
+        <w:pStyle w:val="a6"/>
+        <w:numPr>
+          <w:ilvl w:val="3"/>
+          <w:numId w:val="5"/>
+        </w:numPr>
+        <w:rPr>
+          <w:sz w:val="20"/>
+          <w:szCs w:val="22"/>
+        </w:rPr>
+      </w:pPr>
+      <w:r>
+        <w:rPr>
+          <w:rFonts w:hint="eastAsia"/>
+          <w:sz w:val="20"/>
+          <w:szCs w:val="22"/>
+        </w:rPr>
+        <w:t>기동력을 통한 히트 앤 런 플레이가 가능하다.</w:t>
+      </w:r>
+    </w:p>
+    <w:p>
+      <w:pPr>
+        <w:pStyle w:val="a6"/>
+        <w:numPr>
+          <w:ilvl w:val="3"/>
+          <w:numId w:val="5"/>
+        </w:numPr>
+        <w:rPr>
+          <w:sz w:val="20"/>
+          <w:szCs w:val="22"/>
+        </w:rPr>
+      </w:pPr>
+      <w:r>
+        <w:rPr>
+          <w:rFonts w:hint="eastAsia"/>
+          <w:sz w:val="20"/>
+          <w:szCs w:val="22"/>
+        </w:rPr>
+        <w:t xml:space="preserve">숨겨져 있는 맵 </w:t>
+      </w:r>
+      <w:proofErr w:type="spellStart"/>
+      <w:r>
+        <w:rPr>
+          <w:rFonts w:hint="eastAsia"/>
+          <w:sz w:val="20"/>
+          <w:szCs w:val="22"/>
+        </w:rPr>
+        <w:t>기믹으로</w:t>
+      </w:r>
+      <w:proofErr w:type="spellEnd"/>
+      <w:r>
+        <w:rPr>
+          <w:rFonts w:hint="eastAsia"/>
+          <w:sz w:val="20"/>
+          <w:szCs w:val="22"/>
+        </w:rPr>
+        <w:t xml:space="preserve"> 적을 약화시키는 플레이가 가능하다.</w:t>
+      </w:r>
+    </w:p>
+    <w:p>
+      <w:pPr>
+        <w:pStyle w:val="a6"/>
+        <w:numPr>
+          <w:ilvl w:val="2"/>
+          <w:numId w:val="5"/>
+        </w:numPr>
+        <w:rPr>
+          <w:sz w:val="20"/>
+          <w:szCs w:val="22"/>
+        </w:rPr>
+      </w:pPr>
+      <w:r>
+        <w:rPr>
+          <w:rFonts w:hint="eastAsia"/>
+          <w:sz w:val="20"/>
+          <w:szCs w:val="22"/>
+        </w:rPr>
+        <w:t>특정 파티원을 지원한다.</w:t>
+      </w:r>
+    </w:p>
+    <w:p>
+      <w:pPr>
+        <w:pStyle w:val="a6"/>
+        <w:numPr>
+          <w:ilvl w:val="3"/>
+          <w:numId w:val="5"/>
+        </w:numPr>
+        <w:rPr>
+          <w:sz w:val="20"/>
+          <w:szCs w:val="22"/>
+        </w:rPr>
+      </w:pPr>
+      <w:r>
+        <w:rPr>
+          <w:rFonts w:hint="eastAsia"/>
+          <w:sz w:val="20"/>
+          <w:szCs w:val="22"/>
+        </w:rPr>
+        <w:t>새롭게 강한 무기를 얻은 파티원에게 무기 경험치를 몰아준다.</w:t>
+      </w:r>
+    </w:p>
+    <w:p>
+      <w:pPr>
+        <w:pStyle w:val="a6"/>
+        <w:numPr>
+          <w:ilvl w:val="4"/>
+          <w:numId w:val="5"/>
+        </w:numPr>
+        <w:rPr>
+          <w:sz w:val="20"/>
+          <w:szCs w:val="22"/>
+        </w:rPr>
+      </w:pPr>
+      <w:r>
+        <w:rPr>
+          <w:rFonts w:hint="eastAsia"/>
+          <w:sz w:val="20"/>
+          <w:szCs w:val="22"/>
+        </w:rPr>
+        <w:t xml:space="preserve">나머지 인원은 최대한 </w:t>
+      </w:r>
+      <w:proofErr w:type="spellStart"/>
+      <w:r>
+        <w:rPr>
+          <w:rFonts w:hint="eastAsia"/>
+          <w:sz w:val="20"/>
+          <w:szCs w:val="22"/>
+        </w:rPr>
+        <w:t>어그로와</w:t>
+      </w:r>
+      <w:proofErr w:type="spellEnd"/>
+      <w:r>
+        <w:rPr>
+          <w:rFonts w:hint="eastAsia"/>
+          <w:sz w:val="20"/>
+          <w:szCs w:val="22"/>
+        </w:rPr>
+        <w:t xml:space="preserve"> </w:t>
+      </w:r>
+      <w:proofErr w:type="spellStart"/>
+      <w:r>
+        <w:rPr>
+          <w:rFonts w:hint="eastAsia"/>
+          <w:sz w:val="20"/>
+          <w:szCs w:val="22"/>
+        </w:rPr>
+        <w:t>탱킹</w:t>
+      </w:r>
+      <w:proofErr w:type="spellEnd"/>
+      <w:r>
+        <w:rPr>
+          <w:rFonts w:hint="eastAsia"/>
+          <w:sz w:val="20"/>
+          <w:szCs w:val="22"/>
+        </w:rPr>
+        <w:t xml:space="preserve"> 위주의 플레이를 한다.</w:t>
+      </w:r>
+    </w:p>
+    <w:p>
+      <w:pPr>
+        <w:pStyle w:val="a6"/>
+        <w:numPr>
+          <w:ilvl w:val="4"/>
+          <w:numId w:val="5"/>
+        </w:numPr>
+        <w:rPr>
+          <w:sz w:val="20"/>
+          <w:szCs w:val="22"/>
+        </w:rPr>
+      </w:pPr>
+      <w:r>
+        <w:rPr>
+          <w:rFonts w:hint="eastAsia"/>
+          <w:sz w:val="20"/>
+          <w:szCs w:val="22"/>
+        </w:rPr>
+        <w:t>몰이 사냥을 한다.</w:t>
+      </w:r>
+    </w:p>
+    <w:p>
+      <w:pPr>
+        <w:pStyle w:val="a6"/>
+        <w:numPr>
+          <w:ilvl w:val="3"/>
+          <w:numId w:val="5"/>
+        </w:numPr>
+        <w:rPr>
+          <w:sz w:val="20"/>
+          <w:szCs w:val="22"/>
+        </w:rPr>
+      </w:pPr>
+      <w:r>
+        <w:rPr>
+          <w:rFonts w:hint="eastAsia"/>
+          <w:sz w:val="20"/>
+          <w:szCs w:val="22"/>
+        </w:rPr>
+        <w:t>빠른 성장이 필요한 파티원에게 경험치를 몰아준다.</w:t>
+      </w:r>
+    </w:p>
+    <w:p>
+      <w:pPr>
+        <w:pStyle w:val="a6"/>
+        <w:numPr>
+          <w:ilvl w:val="4"/>
+          <w:numId w:val="5"/>
+        </w:numPr>
+        <w:rPr>
+          <w:sz w:val="20"/>
+          <w:szCs w:val="22"/>
+        </w:rPr>
+      </w:pPr>
+      <w:r>
+        <w:rPr>
+          <w:rFonts w:hint="eastAsia"/>
+          <w:sz w:val="20"/>
+          <w:szCs w:val="22"/>
+        </w:rPr>
+        <w:t>최소 한 번의 공격이나 방어는 하도록 해 처치관여율을 높인다.</w:t>
+      </w:r>
+    </w:p>
+    <w:p>
+      <w:pPr>
+        <w:pStyle w:val="a6"/>
+        <w:numPr>
+          <w:ilvl w:val="4"/>
+          <w:numId w:val="5"/>
+        </w:numPr>
+        <w:rPr>
+          <w:sz w:val="20"/>
+          <w:szCs w:val="22"/>
+        </w:rPr>
+      </w:pPr>
+      <w:r>
+        <w:rPr>
+          <w:rFonts w:hint="eastAsia"/>
+          <w:sz w:val="20"/>
+          <w:szCs w:val="22"/>
+        </w:rPr>
+        <w:t>적들을 거의 다 잡은 후</w:t>
+      </w:r>
+      <w:r>
+        <w:rPr>
+          <w:rFonts w:hint="eastAsia"/>
+          <w:sz w:val="20"/>
+          <w:szCs w:val="22"/>
+        </w:rPr>
+        <w:t>의 마무리 역할을 맡긴다.</w:t>
+      </w:r>
+    </w:p>
+    <w:p>
+      <w:pPr>
+        <w:widowControl/>
+        <w:wordWrap/>
+        <w:autoSpaceDE/>
+        <w:autoSpaceDN/>
+        <w:rPr>
+          <w:sz w:val="12"/>
+          <w:szCs w:val="14"/>
+        </w:rPr>
+      </w:pPr>
+      <w:r>
+        <w:rPr>
+          <w:sz w:val="12"/>
+          <w:szCs w:val="14"/>
+        </w:rPr>
+        <w:br w:type="page"/>
+      </w:r>
+    </w:p>
+    <w:p>
+      <w:pPr>
+        <w:rPr>
+          <w:rFonts w:hint="eastAsia"/>
+          <w:sz w:val="12"/>
+          <w:szCs w:val="14"/>
+        </w:rPr>
+      </w:pPr>
+    </w:p>
+    <w:p>
+      <w:pPr>
+        <w:pStyle w:val="a6"/>
+        <w:numPr>
+          <w:ilvl w:val="1"/>
+          <w:numId w:val="5"/>
+        </w:numPr>
+        <w:rPr>
+          <w:sz w:val="24"/>
+          <w:szCs w:val="28"/>
+        </w:rPr>
+      </w:pPr>
+      <w:r>
+        <w:rPr>
+          <w:rFonts w:hint="eastAsia"/>
+          <w:sz w:val="24"/>
+          <w:szCs w:val="28"/>
+        </w:rPr>
+        <w:t xml:space="preserve">파티 플레이 </w:t>
+      </w:r>
+      <w:proofErr w:type="spellStart"/>
+      <w:r>
+        <w:rPr>
+          <w:rFonts w:hint="eastAsia"/>
+          <w:sz w:val="24"/>
+          <w:szCs w:val="28"/>
+        </w:rPr>
+        <w:t>역할군</w:t>
+      </w:r>
+      <w:proofErr w:type="spellEnd"/>
+    </w:p>
+    <w:p>
+      <w:pPr>
+        <w:pStyle w:val="a6"/>
+        <w:numPr>
+          <w:ilvl w:val="2"/>
+          <w:numId w:val="5"/>
+        </w:numPr>
+        <w:rPr>
+          <w:sz w:val="20"/>
+          <w:szCs w:val="22"/>
+        </w:rPr>
+      </w:pPr>
+      <w:r>
+        <w:rPr>
+          <w:rFonts w:hint="eastAsia"/>
+          <w:sz w:val="20"/>
+          <w:szCs w:val="22"/>
+        </w:rPr>
+        <w:t>탱커</w:t>
+      </w:r>
+    </w:p>
+    <w:p>
+      <w:pPr>
+        <w:pStyle w:val="a6"/>
+        <w:numPr>
+          <w:ilvl w:val="3"/>
+          <w:numId w:val="5"/>
+        </w:numPr>
+        <w:rPr>
+          <w:sz w:val="20"/>
+          <w:szCs w:val="22"/>
+        </w:rPr>
+      </w:pPr>
+      <w:r>
+        <w:rPr>
+          <w:rFonts w:hint="eastAsia"/>
+          <w:sz w:val="20"/>
+          <w:szCs w:val="22"/>
+        </w:rPr>
+        <w:t>적의 공격을 흡수한다.</w:t>
+      </w:r>
+    </w:p>
+    <w:p>
+      <w:pPr>
+        <w:pStyle w:val="a6"/>
+        <w:numPr>
+          <w:ilvl w:val="3"/>
+          <w:numId w:val="5"/>
+        </w:numPr>
+        <w:rPr>
+          <w:sz w:val="20"/>
+          <w:szCs w:val="22"/>
+        </w:rPr>
+      </w:pPr>
+      <w:r>
+        <w:rPr>
+          <w:rFonts w:hint="eastAsia"/>
+          <w:sz w:val="20"/>
+          <w:szCs w:val="22"/>
+        </w:rPr>
+        <w:t>적의 위치를 고정시킨다.</w:t>
+      </w:r>
+    </w:p>
+    <w:p>
+      <w:pPr>
+        <w:pStyle w:val="a6"/>
+        <w:numPr>
+          <w:ilvl w:val="3"/>
+          <w:numId w:val="5"/>
+        </w:numPr>
+        <w:rPr>
+          <w:sz w:val="20"/>
+          <w:szCs w:val="22"/>
+        </w:rPr>
+      </w:pPr>
+      <w:r>
+        <w:rPr>
+          <w:rFonts w:hint="eastAsia"/>
+          <w:sz w:val="20"/>
+          <w:szCs w:val="22"/>
+        </w:rPr>
+        <w:t>적들을 모은다.</w:t>
+      </w:r>
+    </w:p>
+    <w:p>
+      <w:pPr>
+        <w:pStyle w:val="a6"/>
+        <w:numPr>
+          <w:ilvl w:val="3"/>
+          <w:numId w:val="5"/>
+        </w:numPr>
+        <w:rPr>
+          <w:sz w:val="20"/>
+          <w:szCs w:val="22"/>
+        </w:rPr>
+      </w:pPr>
+      <w:r>
+        <w:rPr>
+          <w:rFonts w:hint="eastAsia"/>
+          <w:sz w:val="20"/>
+          <w:szCs w:val="22"/>
+        </w:rPr>
+        <w:t>요충지를 사수한다.</w:t>
+      </w:r>
+    </w:p>
+    <w:p>
+      <w:pPr>
+        <w:pStyle w:val="a6"/>
+        <w:numPr>
+          <w:ilvl w:val="3"/>
+          <w:numId w:val="5"/>
+        </w:numPr>
+        <w:rPr>
+          <w:sz w:val="20"/>
+          <w:szCs w:val="22"/>
+        </w:rPr>
+      </w:pPr>
+      <w:r>
+        <w:rPr>
+          <w:rFonts w:hint="eastAsia"/>
+          <w:sz w:val="20"/>
+          <w:szCs w:val="22"/>
+        </w:rPr>
+        <w:t>파티원이 준비가 될 때까지 시간을 번다.</w:t>
+      </w:r>
+    </w:p>
+    <w:p>
+      <w:pPr>
+        <w:pStyle w:val="a6"/>
+        <w:numPr>
+          <w:ilvl w:val="2"/>
+          <w:numId w:val="5"/>
+        </w:numPr>
+        <w:rPr>
+          <w:sz w:val="20"/>
+          <w:szCs w:val="22"/>
+        </w:rPr>
+      </w:pPr>
+      <w:r>
+        <w:rPr>
+          <w:rFonts w:hint="eastAsia"/>
+          <w:sz w:val="20"/>
+          <w:szCs w:val="22"/>
+        </w:rPr>
+        <w:t>어그로</w:t>
+      </w:r>
+    </w:p>
+    <w:p>
+      <w:pPr>
+        <w:pStyle w:val="a6"/>
+        <w:numPr>
+          <w:ilvl w:val="3"/>
+          <w:numId w:val="5"/>
+        </w:numPr>
+        <w:rPr>
+          <w:sz w:val="20"/>
+          <w:szCs w:val="22"/>
+        </w:rPr>
+      </w:pPr>
+      <w:proofErr w:type="spellStart"/>
+      <w:r>
+        <w:rPr>
+          <w:rFonts w:hint="eastAsia"/>
+          <w:sz w:val="20"/>
+          <w:szCs w:val="22"/>
+        </w:rPr>
+        <w:t>모여있는</w:t>
+      </w:r>
+      <w:proofErr w:type="spellEnd"/>
+      <w:r>
+        <w:rPr>
+          <w:rFonts w:hint="eastAsia"/>
+          <w:sz w:val="20"/>
+          <w:szCs w:val="22"/>
+        </w:rPr>
+        <w:t xml:space="preserve"> 적을 분산시킨다.</w:t>
+      </w:r>
+    </w:p>
+    <w:p>
+      <w:pPr>
+        <w:pStyle w:val="a6"/>
+        <w:numPr>
+          <w:ilvl w:val="3"/>
+          <w:numId w:val="5"/>
+        </w:numPr>
+        <w:rPr>
+          <w:sz w:val="20"/>
+          <w:szCs w:val="22"/>
+        </w:rPr>
+      </w:pPr>
+      <w:r>
+        <w:rPr>
+          <w:rFonts w:hint="eastAsia"/>
+          <w:sz w:val="20"/>
+          <w:szCs w:val="22"/>
+        </w:rPr>
+        <w:t>유리한 지형으로 적을 유인한다.</w:t>
+      </w:r>
+    </w:p>
+    <w:p>
+      <w:pPr>
+        <w:pStyle w:val="a6"/>
+        <w:numPr>
+          <w:ilvl w:val="3"/>
+          <w:numId w:val="5"/>
+        </w:numPr>
+        <w:rPr>
+          <w:sz w:val="20"/>
+          <w:szCs w:val="22"/>
+        </w:rPr>
+      </w:pPr>
+      <w:r>
+        <w:rPr>
+          <w:rFonts w:hint="eastAsia"/>
+          <w:sz w:val="20"/>
+          <w:szCs w:val="22"/>
+        </w:rPr>
+        <w:t>적을 모은다.</w:t>
+      </w:r>
+    </w:p>
+    <w:p>
+      <w:pPr>
+        <w:pStyle w:val="a6"/>
+        <w:numPr>
+          <w:ilvl w:val="3"/>
+          <w:numId w:val="5"/>
+        </w:numPr>
+        <w:rPr>
+          <w:rFonts w:hint="eastAsia"/>
+          <w:sz w:val="20"/>
+          <w:szCs w:val="22"/>
+        </w:rPr>
+      </w:pPr>
+      <w:r>
+        <w:rPr>
+          <w:rFonts w:hint="eastAsia"/>
+          <w:sz w:val="20"/>
+          <w:szCs w:val="22"/>
+        </w:rPr>
+        <w:t>파티원이 준비가 될 때까지 시간을 번다.</w:t>
+      </w:r>
+    </w:p>
+    <w:p>
+      <w:pPr>
+        <w:pStyle w:val="a6"/>
+        <w:numPr>
+          <w:ilvl w:val="2"/>
+          <w:numId w:val="5"/>
+        </w:numPr>
+        <w:rPr>
+          <w:sz w:val="20"/>
+          <w:szCs w:val="22"/>
+        </w:rPr>
+      </w:pPr>
+      <w:r>
+        <w:rPr>
+          <w:rFonts w:hint="eastAsia"/>
+          <w:sz w:val="20"/>
+          <w:szCs w:val="22"/>
+        </w:rPr>
+        <w:t>기동타격</w:t>
+      </w:r>
+    </w:p>
+    <w:p>
+      <w:pPr>
+        <w:pStyle w:val="a6"/>
+        <w:numPr>
+          <w:ilvl w:val="3"/>
+          <w:numId w:val="5"/>
+        </w:numPr>
+        <w:rPr>
+          <w:sz w:val="20"/>
+          <w:szCs w:val="22"/>
+        </w:rPr>
+      </w:pPr>
+      <w:r>
+        <w:rPr>
+          <w:rFonts w:hint="eastAsia"/>
+          <w:sz w:val="20"/>
+          <w:szCs w:val="22"/>
+        </w:rPr>
+        <w:t>적을 추격한다.</w:t>
+      </w:r>
+    </w:p>
+    <w:p>
+      <w:pPr>
+        <w:pStyle w:val="a6"/>
+        <w:numPr>
+          <w:ilvl w:val="3"/>
+          <w:numId w:val="5"/>
+        </w:numPr>
+        <w:rPr>
+          <w:sz w:val="20"/>
+          <w:szCs w:val="22"/>
+        </w:rPr>
+      </w:pPr>
+      <w:proofErr w:type="spellStart"/>
+      <w:r>
+        <w:rPr>
+          <w:rFonts w:hint="eastAsia"/>
+          <w:sz w:val="20"/>
+          <w:szCs w:val="22"/>
+        </w:rPr>
+        <w:t>히트앤런</w:t>
+      </w:r>
+      <w:proofErr w:type="spellEnd"/>
+      <w:r>
+        <w:rPr>
+          <w:rFonts w:hint="eastAsia"/>
+          <w:sz w:val="20"/>
+          <w:szCs w:val="22"/>
+        </w:rPr>
+        <w:t xml:space="preserve"> 플레이를 한다.</w:t>
+      </w:r>
+    </w:p>
+    <w:p>
+      <w:pPr>
+        <w:pStyle w:val="a6"/>
+        <w:numPr>
+          <w:ilvl w:val="3"/>
+          <w:numId w:val="5"/>
+        </w:numPr>
+        <w:rPr>
+          <w:sz w:val="20"/>
+          <w:szCs w:val="22"/>
+        </w:rPr>
+      </w:pPr>
+      <w:r>
+        <w:rPr>
+          <w:rFonts w:hint="eastAsia"/>
+          <w:sz w:val="20"/>
+          <w:szCs w:val="22"/>
+        </w:rPr>
+        <w:t>일시적 수적 우위를 점해 적을 격파한다.</w:t>
+      </w:r>
+    </w:p>
+    <w:p>
+      <w:pPr>
+        <w:pStyle w:val="a6"/>
+        <w:numPr>
+          <w:ilvl w:val="3"/>
+          <w:numId w:val="5"/>
+        </w:numPr>
+        <w:rPr>
+          <w:rFonts w:hint="eastAsia"/>
+          <w:sz w:val="20"/>
+          <w:szCs w:val="22"/>
+        </w:rPr>
+      </w:pPr>
+      <w:r>
+        <w:rPr>
+          <w:rFonts w:hint="eastAsia"/>
+          <w:sz w:val="20"/>
+          <w:szCs w:val="22"/>
+        </w:rPr>
+        <w:t>적들의 진형을 붕괴시킨다</w:t>
+      </w:r>
+      <w:r>
+        <w:rPr>
+          <w:rFonts w:hint="eastAsia"/>
+          <w:sz w:val="20"/>
+          <w:szCs w:val="22"/>
+        </w:rPr>
+        <w:t>.</w:t>
+      </w:r>
+    </w:p>
+    <w:p>
+      <w:pPr>
+        <w:pStyle w:val="a6"/>
+        <w:numPr>
+          <w:ilvl w:val="2"/>
+          <w:numId w:val="5"/>
+        </w:numPr>
+        <w:rPr>
+          <w:sz w:val="20"/>
+          <w:szCs w:val="22"/>
+        </w:rPr>
+      </w:pPr>
+      <w:r>
+        <w:rPr>
+          <w:rFonts w:hint="eastAsia"/>
+          <w:sz w:val="20"/>
+          <w:szCs w:val="22"/>
+        </w:rPr>
+        <w:t>화력</w:t>
+      </w:r>
+    </w:p>
+    <w:p>
+      <w:pPr>
+        <w:pStyle w:val="a6"/>
+        <w:numPr>
+          <w:ilvl w:val="3"/>
+          <w:numId w:val="5"/>
+        </w:numPr>
+        <w:rPr>
+          <w:sz w:val="20"/>
+          <w:szCs w:val="22"/>
+        </w:rPr>
+      </w:pPr>
+      <w:r>
+        <w:rPr>
+          <w:rFonts w:hint="eastAsia"/>
+          <w:sz w:val="20"/>
+          <w:szCs w:val="22"/>
+        </w:rPr>
+        <w:t>적을 격파한다.</w:t>
+      </w:r>
+    </w:p>
+    <w:p>
+      <w:pPr>
+        <w:pStyle w:val="a6"/>
+        <w:numPr>
+          <w:ilvl w:val="3"/>
+          <w:numId w:val="5"/>
+        </w:numPr>
+        <w:rPr>
+          <w:sz w:val="20"/>
+          <w:szCs w:val="22"/>
+        </w:rPr>
+      </w:pPr>
+      <w:r>
+        <w:rPr>
+          <w:rFonts w:hint="eastAsia"/>
+          <w:sz w:val="20"/>
+          <w:szCs w:val="22"/>
+        </w:rPr>
+        <w:t>적의 진형을 붕괴시킨다.</w:t>
+      </w:r>
+    </w:p>
+    <w:p>
+      <w:pPr>
+        <w:pStyle w:val="a6"/>
+        <w:numPr>
+          <w:ilvl w:val="3"/>
+          <w:numId w:val="5"/>
+        </w:numPr>
+        <w:rPr>
+          <w:sz w:val="20"/>
+          <w:szCs w:val="22"/>
+        </w:rPr>
+      </w:pPr>
+      <w:r>
+        <w:rPr>
+          <w:rFonts w:hint="eastAsia"/>
+          <w:sz w:val="20"/>
+          <w:szCs w:val="22"/>
+        </w:rPr>
+        <w:t>위험한 아군을 지원한다.</w:t>
+      </w:r>
+    </w:p>
+    <w:p>
+      <w:pPr>
+        <w:pStyle w:val="a6"/>
+        <w:numPr>
+          <w:ilvl w:val="3"/>
+          <w:numId w:val="5"/>
+        </w:numPr>
+        <w:rPr>
+          <w:sz w:val="20"/>
+          <w:szCs w:val="22"/>
+        </w:rPr>
+      </w:pPr>
+      <w:r>
+        <w:rPr>
+          <w:rFonts w:hint="eastAsia"/>
+          <w:sz w:val="20"/>
+          <w:szCs w:val="22"/>
+        </w:rPr>
+        <w:t>요충지를 사수한다.</w:t>
+      </w:r>
+    </w:p>
+    <w:p>
+      <w:pPr>
+        <w:pStyle w:val="a6"/>
+        <w:numPr>
+          <w:ilvl w:val="2"/>
+          <w:numId w:val="5"/>
+        </w:numPr>
+        <w:rPr>
+          <w:sz w:val="20"/>
+          <w:szCs w:val="22"/>
+        </w:rPr>
+      </w:pPr>
+      <w:r>
+        <w:rPr>
+          <w:rFonts w:hint="eastAsia"/>
+          <w:sz w:val="20"/>
+          <w:szCs w:val="22"/>
+        </w:rPr>
+        <w:t>정찰</w:t>
+      </w:r>
+    </w:p>
+    <w:p>
+      <w:pPr>
+        <w:pStyle w:val="a6"/>
+        <w:numPr>
+          <w:ilvl w:val="3"/>
+          <w:numId w:val="5"/>
+        </w:numPr>
+        <w:rPr>
+          <w:sz w:val="20"/>
+          <w:szCs w:val="22"/>
+        </w:rPr>
+      </w:pPr>
+      <w:proofErr w:type="spellStart"/>
+      <w:r>
+        <w:rPr>
+          <w:rFonts w:hint="eastAsia"/>
+          <w:sz w:val="20"/>
+          <w:szCs w:val="22"/>
+        </w:rPr>
+        <w:t>맵의</w:t>
+      </w:r>
+      <w:proofErr w:type="spellEnd"/>
+      <w:r>
+        <w:rPr>
+          <w:rFonts w:hint="eastAsia"/>
+          <w:sz w:val="20"/>
+          <w:szCs w:val="22"/>
+        </w:rPr>
+        <w:t xml:space="preserve"> </w:t>
+      </w:r>
+      <w:proofErr w:type="spellStart"/>
+      <w:r>
+        <w:rPr>
+          <w:rFonts w:hint="eastAsia"/>
+          <w:sz w:val="20"/>
+          <w:szCs w:val="22"/>
+        </w:rPr>
+        <w:t>기믹을</w:t>
+      </w:r>
+      <w:proofErr w:type="spellEnd"/>
+      <w:r>
+        <w:rPr>
+          <w:rFonts w:hint="eastAsia"/>
+          <w:sz w:val="20"/>
+          <w:szCs w:val="22"/>
+        </w:rPr>
+        <w:t xml:space="preserve"> 파악한다.</w:t>
+      </w:r>
+    </w:p>
+    <w:p>
+      <w:pPr>
+        <w:pStyle w:val="a6"/>
+        <w:numPr>
+          <w:ilvl w:val="3"/>
+          <w:numId w:val="5"/>
+        </w:numPr>
+        <w:rPr>
+          <w:sz w:val="20"/>
+          <w:szCs w:val="22"/>
+        </w:rPr>
+      </w:pPr>
+      <w:r>
+        <w:rPr>
+          <w:rFonts w:hint="eastAsia"/>
+          <w:sz w:val="20"/>
+          <w:szCs w:val="22"/>
+        </w:rPr>
+        <w:t>유리한 지형을 파악한다.</w:t>
+      </w:r>
+    </w:p>
+    <w:p>
+      <w:pPr>
+        <w:pStyle w:val="a6"/>
+        <w:numPr>
+          <w:ilvl w:val="3"/>
+          <w:numId w:val="5"/>
+        </w:numPr>
+        <w:rPr>
+          <w:rFonts w:hint="eastAsia"/>
+          <w:sz w:val="20"/>
+          <w:szCs w:val="22"/>
+        </w:rPr>
+      </w:pPr>
+      <w:r>
+        <w:rPr>
+          <w:rFonts w:hint="eastAsia"/>
+          <w:sz w:val="20"/>
+          <w:szCs w:val="22"/>
+        </w:rPr>
+        <w:t>적의 숫자와 전술을 파악한다.</w:t>
+      </w:r>
+    </w:p>
+    <w:p>
+      <w:pPr>
+        <w:widowControl/>
+        <w:wordWrap/>
+        <w:autoSpaceDE/>
+        <w:autoSpaceDN/>
+        <w:rPr>
+          <w:rFonts w:hint="eastAsia"/>
+        </w:rPr>
+      </w:pPr>
+      <w:r>
+        <w:br w:type="page"/>
+      </w:r>
+    </w:p>
+    <w:p>
+      <w:r>
+        <w:rPr>
+          <w:rFonts w:hint="eastAsia"/>
+        </w:rPr>
+        <w:lastRenderedPageBreak/>
+        <w:t>월드</w:t>
+      </w:r>
       <w:r>
         <w:t xml:space="preserve"> 컨셉</w:t>
       </w:r>
     </w:p>
     <w:p>
-      <w:r>
-        <w:rPr>
-          <w:rFonts w:hint="eastAsia"/>
-        </w:rPr>
-        <w:t>파티</w:t>
-      </w:r>
-      <w:r>
-        <w:t xml:space="preserve"> 기능</w:t>
-      </w:r>
-    </w:p>
-    <w:p>
-      <w:r>
-        <w:rPr>
-          <w:rFonts w:hint="eastAsia"/>
-        </w:rPr>
-        <w:t>파티와</w:t>
-      </w:r>
-      <w:r>
-        <w:t xml:space="preserve"> 몬스터의 상호작용</w:t>
-      </w:r>
-    </w:p>
-    <w:p>
-      <w:r>
-        <w:rPr>
-          <w:rFonts w:hint="eastAsia"/>
-        </w:rPr>
-        <w:t>월드</w:t>
-      </w:r>
-      <w:r>
-        <w:t xml:space="preserve"> 컨셉</w:t>
+      <w:pPr>
+        <w:rPr>
+          <w:rFonts w:hint="eastAsia"/>
+        </w:rPr>
+      </w:pPr>
+      <w:r>
+        <w:rPr>
+          <w:rFonts w:hint="eastAsia"/>
+        </w:rPr>
+        <w:t>몬스터의 전술과 대응</w:t>
       </w:r>
     </w:p>
     <w:p>
@@ -10545,6 +11713,129 @@
     </w:lvl>
   </w:abstractNum>
   <w:abstractNum w:abstractNumId="9" w15:restartNumberingAfterBreak="0">
+    <w:nsid w:val="7ED87A77"/>
+    <w:multiLevelType w:val="multilevel"/>
+    <w:tmpl w:val="E5441B28"/>
+    <w:lvl w:ilvl="0">
+      <w:start w:val="1"/>
+      <w:numFmt w:val="decimal"/>
+      <w:suff w:val="nothing"/>
+      <w:lvlText w:val="Chapter %1."/>
+      <w:lvlJc w:val="left"/>
+      <w:pPr>
+        <w:ind w:left="0" w:firstLine="0"/>
+      </w:pPr>
+      <w:rPr>
+        <w:rFonts w:asciiTheme="majorHAnsi" w:eastAsia="맑은 고딕" w:hAnsiTheme="majorHAnsi" w:hint="default"/>
+        <w:b/>
+        <w:i w:val="0"/>
+        <w:sz w:val="32"/>
+      </w:rPr>
+    </w:lvl>
+    <w:lvl w:ilvl="1">
+      <w:start w:val="1"/>
+      <w:numFmt w:val="decimal"/>
+      <w:lvlText w:val="%2."/>
+      <w:lvlJc w:val="left"/>
+      <w:pPr>
+        <w:ind w:left="539" w:hanging="426"/>
+      </w:pPr>
+      <w:rPr>
+        <w:rFonts w:asciiTheme="minorHAnsi" w:eastAsia="맑은 고딕" w:hAnsiTheme="minorHAnsi" w:hint="default"/>
+        <w:sz w:val="24"/>
+        <w:szCs w:val="24"/>
+      </w:rPr>
+    </w:lvl>
+    <w:lvl w:ilvl="2">
+      <w:start w:val="1"/>
+      <w:numFmt w:val="upperLetter"/>
+      <w:lvlText w:val="%3."/>
+      <w:lvlJc w:val="left"/>
+      <w:pPr>
+        <w:ind w:left="992" w:hanging="425"/>
+      </w:pPr>
+      <w:rPr>
+        <w:rFonts w:hint="eastAsia"/>
+        <w:sz w:val="20"/>
+        <w:szCs w:val="24"/>
+      </w:rPr>
+    </w:lvl>
+    <w:lvl w:ilvl="3">
+      <w:start w:val="1"/>
+      <w:numFmt w:val="ganada"/>
+      <w:lvlText w:val="(%4)"/>
+      <w:lvlJc w:val="left"/>
+      <w:pPr>
+        <w:ind w:left="1899" w:hanging="425"/>
+      </w:pPr>
+      <w:rPr>
+        <w:rFonts w:hint="eastAsia"/>
+        <w:sz w:val="20"/>
+      </w:rPr>
+    </w:lvl>
+    <w:lvl w:ilvl="4">
+      <w:start w:val="1"/>
+      <w:numFmt w:val="decimalEnclosedCircle"/>
+      <w:lvlText w:val="%5"/>
+      <w:lvlJc w:val="left"/>
+      <w:pPr>
+        <w:ind w:left="2580" w:hanging="425"/>
+      </w:pPr>
+      <w:rPr>
+        <w:rFonts w:hint="eastAsia"/>
+        <w:sz w:val="20"/>
+      </w:rPr>
+    </w:lvl>
+    <w:lvl w:ilvl="5">
+      <w:start w:val="1"/>
+      <w:numFmt w:val="decimal"/>
+      <w:lvlText w:val="%1.%2.%3.%4.%5.%6"/>
+      <w:lvlJc w:val="left"/>
+      <w:pPr>
+        <w:ind w:left="3260" w:hanging="1134"/>
+      </w:pPr>
+      <w:rPr>
+        <w:rFonts w:hint="eastAsia"/>
+      </w:rPr>
+    </w:lvl>
+    <w:lvl w:ilvl="6">
+      <w:start w:val="1"/>
+      <w:numFmt w:val="decimal"/>
+      <w:lvlText w:val="%1.%2.%3.%4.%5.%6.%7"/>
+      <w:lvlJc w:val="left"/>
+      <w:pPr>
+        <w:ind w:left="3827" w:hanging="1276"/>
+      </w:pPr>
+      <w:rPr>
+        <w:rFonts w:hint="eastAsia"/>
+      </w:rPr>
+    </w:lvl>
+    <w:lvl w:ilvl="7">
+      <w:start w:val="1"/>
+      <w:numFmt w:val="decimal"/>
+      <w:lvlText w:val="%1.%2.%3.%4.%5.%6.%7.%8"/>
+      <w:lvlJc w:val="left"/>
+      <w:pPr>
+        <w:ind w:left="4394" w:hanging="1418"/>
+      </w:pPr>
+      <w:rPr>
+        <w:rFonts w:hint="eastAsia"/>
+      </w:rPr>
+    </w:lvl>
+    <w:lvl w:ilvl="8">
+      <w:start w:val="1"/>
+      <w:numFmt w:val="decimal"/>
+      <w:lvlText w:val="%1.%2.%3.%4.%5.%6.%7.%8.%9"/>
+      <w:lvlJc w:val="left"/>
+      <w:pPr>
+        <w:ind w:left="5102" w:hanging="1700"/>
+      </w:pPr>
+      <w:rPr>
+        <w:rFonts w:hint="eastAsia"/>
+      </w:rPr>
+    </w:lvl>
+  </w:abstractNum>
+  <w:abstractNum w:abstractNumId="10" w15:restartNumberingAfterBreak="0">
     <w:nsid w:val="7EF667A5"/>
     <w:multiLevelType w:val="multilevel"/>
     <w:tmpl w:val="AFCA5282"/>
@@ -10661,7 +11952,7 @@
     </w:lvl>
   </w:abstractNum>
   <w:num w:numId="1" w16cid:durableId="588779163">
-    <w:abstractNumId w:val="9"/>
+    <w:abstractNumId w:val="10"/>
   </w:num>
   <w:num w:numId="2" w16cid:durableId="1761177560">
     <w:abstractNumId w:val="1"/>
@@ -10689,6 +11980,9 @@
   </w:num>
   <w:num w:numId="10" w16cid:durableId="1349871843">
     <w:abstractNumId w:val="0"/>
+  </w:num>
+  <w:num w:numId="11" w16cid:durableId="856237708">
+    <w:abstractNumId w:val="9"/>
   </w:num>
 </w:numbering>
 </file>

</xml_diff>